<commit_message>
Update CV to add AI specifics
</commit_message>
<xml_diff>
--- a/frontend-vue/david_bramler_cv.docx
+++ b/frontend-vue/david_bramler_cv.docx
@@ -288,8 +288,26 @@
           <w:sz w:val="22"/>
           <w:szCs w:val="22"/>
         </w:rPr>
-        <w:t>An advocate for infrastructure as code</w:t>
-      </w:r>
+        <w:t>A</w:t>
+      </w:r>
+      <w:r>
+        <w:rPr>
+          <w:rFonts w:ascii="Arial" w:hAnsi="Arial" w:cs="Arial"/>
+          <w:sz w:val="22"/>
+          <w:szCs w:val="22"/>
+        </w:rPr>
+        <w:t xml:space="preserve">dvocate for </w:t>
+      </w:r>
+      <w:proofErr w:type="spellStart"/>
+      <w:r>
+        <w:rPr>
+          <w:rFonts w:ascii="Arial" w:hAnsi="Arial" w:cs="Arial"/>
+          <w:sz w:val="22"/>
+          <w:szCs w:val="22"/>
+        </w:rPr>
+        <w:t>IaC</w:t>
+      </w:r>
+      <w:proofErr w:type="spellEnd"/>
       <w:r>
         <w:rPr>
           <w:rFonts w:ascii="Arial" w:hAnsi="Arial" w:cs="Arial"/>
@@ -320,7 +338,39 @@
           <w:sz w:val="22"/>
           <w:szCs w:val="22"/>
         </w:rPr>
-        <w:t xml:space="preserve"> pipelines. Experienced across many infrastructure stacks, from barebones servers to serverless. </w:t>
+        <w:t xml:space="preserve">. Experienced across many </w:t>
+      </w:r>
+      <w:r>
+        <w:rPr>
+          <w:rFonts w:ascii="Arial" w:hAnsi="Arial" w:cs="Arial"/>
+          <w:sz w:val="22"/>
+          <w:szCs w:val="22"/>
+        </w:rPr>
+        <w:t>architectures</w:t>
+      </w:r>
+      <w:r>
+        <w:rPr>
+          <w:rFonts w:ascii="Arial" w:hAnsi="Arial" w:cs="Arial"/>
+          <w:sz w:val="22"/>
+          <w:szCs w:val="22"/>
+        </w:rPr>
+        <w:t>, barebones servers to</w:t>
+      </w:r>
+      <w:r>
+        <w:rPr>
+          <w:rFonts w:ascii="Arial" w:hAnsi="Arial" w:cs="Arial"/>
+          <w:sz w:val="22"/>
+          <w:szCs w:val="22"/>
+        </w:rPr>
+        <w:t xml:space="preserve"> event driven</w:t>
+      </w:r>
+      <w:r>
+        <w:rPr>
+          <w:rFonts w:ascii="Arial" w:hAnsi="Arial" w:cs="Arial"/>
+          <w:sz w:val="22"/>
+          <w:szCs w:val="22"/>
+        </w:rPr>
+        <w:t xml:space="preserve"> serverless. </w:t>
       </w:r>
       <w:r>
         <w:rPr>
@@ -537,13 +587,7 @@
         <w:rPr>
           <w:rFonts w:ascii="Arial" w:hAnsi="Arial"/>
         </w:rPr>
-        <w:t xml:space="preserve">, </w:t>
-      </w:r>
-      <w:r>
-        <w:rPr>
-          <w:rFonts w:ascii="Arial" w:hAnsi="Arial"/>
-        </w:rPr>
-        <w:t xml:space="preserve">Django, Terraform, Kubernetes, GCP, CDK, AWS, Docker, </w:t>
+        <w:t xml:space="preserve">, Django, Terraform, Kubernetes, GCP, CDK, AWS, Docker, </w:t>
       </w:r>
       <w:r>
         <w:rPr>
@@ -567,11 +611,6 @@
     <w:p>
       <w:pPr>
         <w:spacing w:line="360" w:lineRule="auto"/>
-        <w:rPr>
-          <w:rFonts w:ascii="Arial" w:hAnsi="Arial"/>
-          <w:sz w:val="22"/>
-          <w:szCs w:val="22"/>
-        </w:rPr>
       </w:pPr>
     </w:p>
     <w:p>
@@ -714,15 +753,7 @@
           <w:sz w:val="22"/>
           <w:szCs w:val="22"/>
         </w:rPr>
-        <w:t xml:space="preserve"> </w:t>
-      </w:r>
-      <w:r>
-        <w:rPr>
-          <w:rFonts w:ascii="Arial" w:hAnsi="Arial"/>
-          <w:sz w:val="22"/>
-          <w:szCs w:val="22"/>
-        </w:rPr>
-        <w:t>Playwright</w:t>
+        <w:t xml:space="preserve"> Playwright</w:t>
       </w:r>
       <w:r>
         <w:rPr>
@@ -763,6 +794,40 @@
           <w:szCs w:val="22"/>
         </w:rPr>
         <w:t>.</w:t>
+      </w:r>
+      <w:r>
+        <w:rPr>
+          <w:rFonts w:ascii="Arial" w:hAnsi="Arial"/>
+          <w:sz w:val="22"/>
+          <w:szCs w:val="22"/>
+        </w:rPr>
+        <w:t xml:space="preserve"> Led the adoption of </w:t>
+      </w:r>
+      <w:r>
+        <w:rPr>
+          <w:rFonts w:ascii="Arial" w:hAnsi="Arial"/>
+          <w:sz w:val="22"/>
+          <w:szCs w:val="22"/>
+        </w:rPr>
+        <w:t xml:space="preserve">development workflows using GitHub Copilot, Aider and </w:t>
+      </w:r>
+      <w:proofErr w:type="spellStart"/>
+      <w:r>
+        <w:rPr>
+          <w:rFonts w:ascii="Arial" w:hAnsi="Arial"/>
+          <w:sz w:val="22"/>
+          <w:szCs w:val="22"/>
+        </w:rPr>
+        <w:t>OpenCode</w:t>
+      </w:r>
+      <w:proofErr w:type="spellEnd"/>
+      <w:r>
+        <w:rPr>
+          <w:rFonts w:ascii="Arial" w:hAnsi="Arial"/>
+          <w:sz w:val="22"/>
+          <w:szCs w:val="22"/>
+        </w:rPr>
+        <w:t xml:space="preserve"> to improve engineering productivity.</w:t>
       </w:r>
     </w:p>
     <w:p>
@@ -899,28 +964,94 @@
         </w:rPr>
         <w:t>Increased release frequency from once every two months to multiple times per week by reworking the SDLC to include automated testing, ephemeral environments and automated deployments.</w:t>
       </w:r>
-    </w:p>
-    <w:p>
-      <w:pPr>
-        <w:pStyle w:val="ListParagraph"/>
-        <w:tabs>
-          <w:tab w:val="clear" w:pos="720"/>
-        </w:tabs>
-        <w:spacing w:line="360" w:lineRule="auto"/>
-        <w:rPr>
-          <w:rFonts w:ascii="Arial" w:hAnsi="Arial"/>
-          <w:sz w:val="22"/>
-          <w:szCs w:val="22"/>
-        </w:rPr>
-      </w:pPr>
-    </w:p>
-    <w:p>
-      <w:pPr>
-        <w:tabs>
-          <w:tab w:val="clear" w:pos="720"/>
-        </w:tabs>
-        <w:spacing w:line="360" w:lineRule="auto"/>
-      </w:pPr>
+      <w:r>
+        <w:rPr>
+          <w:rFonts w:ascii="Arial" w:hAnsi="Arial"/>
+          <w:sz w:val="22"/>
+          <w:szCs w:val="22"/>
+        </w:rPr>
+        <w:t xml:space="preserve"> </w:t>
+      </w:r>
+      <w:r>
+        <w:rPr>
+          <w:rFonts w:ascii="Arial" w:hAnsi="Arial"/>
+          <w:sz w:val="22"/>
+          <w:szCs w:val="22"/>
+        </w:rPr>
+        <w:t>Collaborated on the implementation of</w:t>
+      </w:r>
+      <w:r>
+        <w:rPr>
+          <w:rFonts w:ascii="Arial" w:hAnsi="Arial"/>
+          <w:sz w:val="22"/>
+          <w:szCs w:val="22"/>
+        </w:rPr>
+        <w:t xml:space="preserve"> </w:t>
+      </w:r>
+      <w:r>
+        <w:rPr>
+          <w:rFonts w:ascii="Arial" w:hAnsi="Arial"/>
+          <w:sz w:val="22"/>
+          <w:szCs w:val="22"/>
+        </w:rPr>
+        <w:t>automated</w:t>
+      </w:r>
+      <w:r>
+        <w:rPr>
+          <w:rFonts w:ascii="Arial" w:hAnsi="Arial"/>
+          <w:sz w:val="22"/>
+          <w:szCs w:val="22"/>
+        </w:rPr>
+        <w:t xml:space="preserve"> AI</w:t>
+      </w:r>
+      <w:r>
+        <w:rPr>
+          <w:rFonts w:ascii="Arial" w:hAnsi="Arial"/>
+          <w:sz w:val="22"/>
+          <w:szCs w:val="22"/>
+        </w:rPr>
+        <w:t xml:space="preserve"> translation of LMS management dashboards</w:t>
+      </w:r>
+      <w:r>
+        <w:rPr>
+          <w:rFonts w:ascii="Arial" w:hAnsi="Arial"/>
+          <w:sz w:val="22"/>
+          <w:szCs w:val="22"/>
+        </w:rPr>
+        <w:t xml:space="preserve"> and the i</w:t>
+      </w:r>
+      <w:r>
+        <w:rPr>
+          <w:rFonts w:ascii="Arial" w:hAnsi="Arial"/>
+          <w:sz w:val="22"/>
+          <w:szCs w:val="22"/>
+        </w:rPr>
+        <w:t>nvestigation of</w:t>
+      </w:r>
+      <w:r>
+        <w:rPr>
+          <w:rFonts w:ascii="Arial" w:hAnsi="Arial"/>
+          <w:sz w:val="22"/>
+          <w:szCs w:val="22"/>
+        </w:rPr>
+        <w:t xml:space="preserve"> AI powered,</w:t>
+      </w:r>
+      <w:r>
+        <w:rPr>
+          <w:rFonts w:ascii="Arial" w:hAnsi="Arial"/>
+          <w:sz w:val="22"/>
+          <w:szCs w:val="22"/>
+        </w:rPr>
+        <w:t xml:space="preserve"> natural-language-driven reporting for clients</w:t>
+      </w:r>
+      <w:r>
+        <w:rPr>
+          <w:rFonts w:ascii="Arial" w:hAnsi="Arial"/>
+          <w:sz w:val="22"/>
+          <w:szCs w:val="22"/>
+        </w:rPr>
+        <w:t>.</w:t>
+      </w:r>
     </w:p>
     <w:p>
       <w:pPr>
@@ -2212,6 +2343,155 @@
       </w:rPr>
     </w:lvl>
   </w:abstractNum>
+  <w:abstractNum w:abstractNumId="4" w15:restartNumberingAfterBreak="0">
+    <w:nsid w:val="634D40A6"/>
+    <w:multiLevelType w:val="multilevel"/>
+    <w:tmpl w:val="D208FFD4"/>
+    <w:lvl w:ilvl="0">
+      <w:start w:val="1"/>
+      <w:numFmt w:val="bullet"/>
+      <w:lvlText w:val=""/>
+      <w:lvlJc w:val="left"/>
+      <w:pPr>
+        <w:tabs>
+          <w:tab w:val="num" w:pos="720"/>
+        </w:tabs>
+        <w:ind w:left="720" w:hanging="360"/>
+      </w:pPr>
+      <w:rPr>
+        <w:rFonts w:ascii="Symbol" w:hAnsi="Symbol" w:hint="default"/>
+        <w:sz w:val="20"/>
+      </w:rPr>
+    </w:lvl>
+    <w:lvl w:ilvl="1" w:tentative="1">
+      <w:start w:val="1"/>
+      <w:numFmt w:val="bullet"/>
+      <w:lvlText w:val="o"/>
+      <w:lvlJc w:val="left"/>
+      <w:pPr>
+        <w:tabs>
+          <w:tab w:val="num" w:pos="1440"/>
+        </w:tabs>
+        <w:ind w:left="1440" w:hanging="360"/>
+      </w:pPr>
+      <w:rPr>
+        <w:rFonts w:ascii="Courier New" w:hAnsi="Courier New" w:hint="default"/>
+        <w:sz w:val="20"/>
+      </w:rPr>
+    </w:lvl>
+    <w:lvl w:ilvl="2" w:tentative="1">
+      <w:start w:val="1"/>
+      <w:numFmt w:val="bullet"/>
+      <w:lvlText w:val=""/>
+      <w:lvlJc w:val="left"/>
+      <w:pPr>
+        <w:tabs>
+          <w:tab w:val="num" w:pos="2160"/>
+        </w:tabs>
+        <w:ind w:left="2160" w:hanging="360"/>
+      </w:pPr>
+      <w:rPr>
+        <w:rFonts w:ascii="Wingdings" w:hAnsi="Wingdings" w:hint="default"/>
+        <w:sz w:val="20"/>
+      </w:rPr>
+    </w:lvl>
+    <w:lvl w:ilvl="3" w:tentative="1">
+      <w:start w:val="1"/>
+      <w:numFmt w:val="bullet"/>
+      <w:lvlText w:val=""/>
+      <w:lvlJc w:val="left"/>
+      <w:pPr>
+        <w:tabs>
+          <w:tab w:val="num" w:pos="2880"/>
+        </w:tabs>
+        <w:ind w:left="2880" w:hanging="360"/>
+      </w:pPr>
+      <w:rPr>
+        <w:rFonts w:ascii="Wingdings" w:hAnsi="Wingdings" w:hint="default"/>
+        <w:sz w:val="20"/>
+      </w:rPr>
+    </w:lvl>
+    <w:lvl w:ilvl="4" w:tentative="1">
+      <w:start w:val="1"/>
+      <w:numFmt w:val="bullet"/>
+      <w:lvlText w:val=""/>
+      <w:lvlJc w:val="left"/>
+      <w:pPr>
+        <w:tabs>
+          <w:tab w:val="num" w:pos="3600"/>
+        </w:tabs>
+        <w:ind w:left="3600" w:hanging="360"/>
+      </w:pPr>
+      <w:rPr>
+        <w:rFonts w:ascii="Wingdings" w:hAnsi="Wingdings" w:hint="default"/>
+        <w:sz w:val="20"/>
+      </w:rPr>
+    </w:lvl>
+    <w:lvl w:ilvl="5" w:tentative="1">
+      <w:start w:val="1"/>
+      <w:numFmt w:val="bullet"/>
+      <w:lvlText w:val=""/>
+      <w:lvlJc w:val="left"/>
+      <w:pPr>
+        <w:tabs>
+          <w:tab w:val="num" w:pos="4320"/>
+        </w:tabs>
+        <w:ind w:left="4320" w:hanging="360"/>
+      </w:pPr>
+      <w:rPr>
+        <w:rFonts w:ascii="Wingdings" w:hAnsi="Wingdings" w:hint="default"/>
+        <w:sz w:val="20"/>
+      </w:rPr>
+    </w:lvl>
+    <w:lvl w:ilvl="6" w:tentative="1">
+      <w:start w:val="1"/>
+      <w:numFmt w:val="bullet"/>
+      <w:lvlText w:val=""/>
+      <w:lvlJc w:val="left"/>
+      <w:pPr>
+        <w:tabs>
+          <w:tab w:val="num" w:pos="5040"/>
+        </w:tabs>
+        <w:ind w:left="5040" w:hanging="360"/>
+      </w:pPr>
+      <w:rPr>
+        <w:rFonts w:ascii="Wingdings" w:hAnsi="Wingdings" w:hint="default"/>
+        <w:sz w:val="20"/>
+      </w:rPr>
+    </w:lvl>
+    <w:lvl w:ilvl="7" w:tentative="1">
+      <w:start w:val="1"/>
+      <w:numFmt w:val="bullet"/>
+      <w:lvlText w:val=""/>
+      <w:lvlJc w:val="left"/>
+      <w:pPr>
+        <w:tabs>
+          <w:tab w:val="num" w:pos="5760"/>
+        </w:tabs>
+        <w:ind w:left="5760" w:hanging="360"/>
+      </w:pPr>
+      <w:rPr>
+        <w:rFonts w:ascii="Wingdings" w:hAnsi="Wingdings" w:hint="default"/>
+        <w:sz w:val="20"/>
+      </w:rPr>
+    </w:lvl>
+    <w:lvl w:ilvl="8" w:tentative="1">
+      <w:start w:val="1"/>
+      <w:numFmt w:val="bullet"/>
+      <w:lvlText w:val=""/>
+      <w:lvlJc w:val="left"/>
+      <w:pPr>
+        <w:tabs>
+          <w:tab w:val="num" w:pos="6480"/>
+        </w:tabs>
+        <w:ind w:left="6480" w:hanging="360"/>
+      </w:pPr>
+      <w:rPr>
+        <w:rFonts w:ascii="Wingdings" w:hAnsi="Wingdings" w:hint="default"/>
+        <w:sz w:val="20"/>
+      </w:rPr>
+    </w:lvl>
+  </w:abstractNum>
   <w:num w:numId="1" w16cid:durableId="521287953">
     <w:abstractNumId w:val="0"/>
   </w:num>
@@ -2223,6 +2503,9 @@
   </w:num>
   <w:num w:numId="4" w16cid:durableId="1788355490">
     <w:abstractNumId w:val="1"/>
+  </w:num>
+  <w:num w:numId="5" w16cid:durableId="2114939343">
+    <w:abstractNumId w:val="4"/>
   </w:num>
 </w:numbering>
 </file>
@@ -2691,7 +2974,6 @@
   <w:style w:type="character" w:default="1" w:styleId="DefaultParagraphFont">
     <w:name w:val="Default Paragraph Font"/>
     <w:uiPriority w:val="1"/>
-    <w:semiHidden/>
     <w:unhideWhenUsed/>
   </w:style>
   <w:style w:type="table" w:default="1" w:styleId="TableNormal">

</xml_diff>